<commit_message>
LU 5-toelichting: zelfstandig en zelfsturend werken
Co-Authored-By: Claude Opus 5.5 <noreply@anthropic.com>
</commit_message>
<xml_diff>
--- a/docs/leeruitkomsten.docx
+++ b/docs/leeruitkomsten.docx
@@ -98,7 +98,7 @@
       <w:r>
         <w:fldChar w:fldCharType="separate"/>
       </w:r>
-      <w:hyperlink w:anchor="_Toc244102828" w:history="1">
+      <w:hyperlink w:anchor="_Toc244103674" w:history="1">
         <w:r>
           <w:rPr>
             <w:rStyle w:val="Hyperlink"/>
@@ -125,7 +125,7 @@
             <w:noProof/>
             <w:webHidden/>
           </w:rPr>
-          <w:instrText xml:space="preserve"> PAGEREF _Toc244102828 \h </w:instrText>
+          <w:instrText xml:space="preserve"> PAGEREF _Toc244103674 \h </w:instrText>
         </w:r>
         <w:r>
           <w:rPr>
@@ -166,7 +166,7 @@
           <w:noProof/>
         </w:rPr>
       </w:pPr>
-      <w:hyperlink w:anchor="_Toc244102829" w:history="1">
+      <w:hyperlink w:anchor="_Toc244103675" w:history="1">
         <w:r>
           <w:rPr>
             <w:rStyle w:val="Hyperlink"/>
@@ -193,7 +193,7 @@
             <w:noProof/>
             <w:webHidden/>
           </w:rPr>
-          <w:instrText xml:space="preserve"> PAGEREF _Toc244102829 \h </w:instrText>
+          <w:instrText xml:space="preserve"> PAGEREF _Toc244103675 \h </w:instrText>
         </w:r>
         <w:r>
           <w:rPr>
@@ -234,7 +234,7 @@
           <w:noProof/>
         </w:rPr>
       </w:pPr>
-      <w:hyperlink w:anchor="_Toc244102830" w:history="1">
+      <w:hyperlink w:anchor="_Toc244103676" w:history="1">
         <w:r>
           <w:rPr>
             <w:rStyle w:val="Hyperlink"/>
@@ -261,7 +261,7 @@
             <w:noProof/>
             <w:webHidden/>
           </w:rPr>
-          <w:instrText xml:space="preserve"> PAGEREF _Toc244102830 \h </w:instrText>
+          <w:instrText xml:space="preserve"> PAGEREF _Toc244103676 \h </w:instrText>
         </w:r>
         <w:r>
           <w:rPr>
@@ -302,7 +302,7 @@
           <w:noProof/>
         </w:rPr>
       </w:pPr>
-      <w:hyperlink w:anchor="_Toc244102831" w:history="1">
+      <w:hyperlink w:anchor="_Toc244103677" w:history="1">
         <w:r>
           <w:rPr>
             <w:rStyle w:val="Hyperlink"/>
@@ -329,7 +329,7 @@
             <w:noProof/>
             <w:webHidden/>
           </w:rPr>
-          <w:instrText xml:space="preserve"> PAGEREF _Toc244102831 \h </w:instrText>
+          <w:instrText xml:space="preserve"> PAGEREF _Toc244103677 \h </w:instrText>
         </w:r>
         <w:r>
           <w:rPr>
@@ -370,7 +370,7 @@
           <w:noProof/>
         </w:rPr>
       </w:pPr>
-      <w:hyperlink w:anchor="_Toc244102832" w:history="1">
+      <w:hyperlink w:anchor="_Toc244103678" w:history="1">
         <w:r>
           <w:rPr>
             <w:rStyle w:val="Hyperlink"/>
@@ -397,7 +397,7 @@
             <w:noProof/>
             <w:webHidden/>
           </w:rPr>
-          <w:instrText xml:space="preserve"> PAGEREF _Toc244102832 \h </w:instrText>
+          <w:instrText xml:space="preserve"> PAGEREF _Toc244103678 \h </w:instrText>
         </w:r>
         <w:r>
           <w:rPr>
@@ -418,6 +418,346 @@
             <w:webHidden/>
           </w:rPr>
           <w:t>4</w:t>
+        </w:r>
+        <w:r>
+          <w:rPr>
+            <w:noProof/>
+            <w:webHidden/>
+          </w:rPr>
+          <w:fldChar w:fldCharType="end"/>
+        </w:r>
+      </w:hyperlink>
+    </w:p>
+    <w:p>
+      <w:pPr>
+        <w:pStyle w:val="TOC1"/>
+        <w:tabs>
+          <w:tab w:val="right" w:leader="dot" w:pos="9736"/>
+        </w:tabs>
+        <w:rPr>
+          <w:noProof/>
+        </w:rPr>
+      </w:pPr>
+      <w:hyperlink w:anchor="_Toc244103679" w:history="1">
+        <w:r>
+          <w:rPr>
+            <w:rStyle w:val="Hyperlink"/>
+            <w:noProof/>
+          </w:rPr>
+          <w:t>Toelichting LU 5: zelfstandig en zelfsturend werken</w:t>
+        </w:r>
+        <w:r>
+          <w:rPr>
+            <w:noProof/>
+            <w:webHidden/>
+          </w:rPr>
+          <w:tab/>
+        </w:r>
+        <w:r>
+          <w:rPr>
+            <w:noProof/>
+            <w:webHidden/>
+          </w:rPr>
+          <w:fldChar w:fldCharType="begin"/>
+        </w:r>
+        <w:r>
+          <w:rPr>
+            <w:noProof/>
+            <w:webHidden/>
+          </w:rPr>
+          <w:instrText xml:space="preserve"> PAGEREF _Toc244103679 \h </w:instrText>
+        </w:r>
+        <w:r>
+          <w:rPr>
+            <w:noProof/>
+            <w:webHidden/>
+          </w:rPr>
+        </w:r>
+        <w:r>
+          <w:rPr>
+            <w:noProof/>
+            <w:webHidden/>
+          </w:rPr>
+          <w:fldChar w:fldCharType="separate"/>
+        </w:r>
+        <w:r>
+          <w:rPr>
+            <w:noProof/>
+            <w:webHidden/>
+          </w:rPr>
+          <w:t>5</w:t>
+        </w:r>
+        <w:r>
+          <w:rPr>
+            <w:noProof/>
+            <w:webHidden/>
+          </w:rPr>
+          <w:fldChar w:fldCharType="end"/>
+        </w:r>
+      </w:hyperlink>
+    </w:p>
+    <w:p>
+      <w:pPr>
+        <w:pStyle w:val="TOC2"/>
+        <w:tabs>
+          <w:tab w:val="right" w:leader="dot" w:pos="9736"/>
+        </w:tabs>
+        <w:rPr>
+          <w:noProof/>
+        </w:rPr>
+      </w:pPr>
+      <w:hyperlink w:anchor="_Toc244103680" w:history="1">
+        <w:r>
+          <w:rPr>
+            <w:rStyle w:val="Hyperlink"/>
+            <w:noProof/>
+          </w:rPr>
+          <w:t>Hoe ik het project heb aangepakt</w:t>
+        </w:r>
+        <w:r>
+          <w:rPr>
+            <w:noProof/>
+            <w:webHidden/>
+          </w:rPr>
+          <w:tab/>
+        </w:r>
+        <w:r>
+          <w:rPr>
+            <w:noProof/>
+            <w:webHidden/>
+          </w:rPr>
+          <w:fldChar w:fldCharType="begin"/>
+        </w:r>
+        <w:r>
+          <w:rPr>
+            <w:noProof/>
+            <w:webHidden/>
+          </w:rPr>
+          <w:instrText xml:space="preserve"> PAGEREF _Toc244103680 \h </w:instrText>
+        </w:r>
+        <w:r>
+          <w:rPr>
+            <w:noProof/>
+            <w:webHidden/>
+          </w:rPr>
+        </w:r>
+        <w:r>
+          <w:rPr>
+            <w:noProof/>
+            <w:webHidden/>
+          </w:rPr>
+          <w:fldChar w:fldCharType="separate"/>
+        </w:r>
+        <w:r>
+          <w:rPr>
+            <w:noProof/>
+            <w:webHidden/>
+          </w:rPr>
+          <w:t>5</w:t>
+        </w:r>
+        <w:r>
+          <w:rPr>
+            <w:noProof/>
+            <w:webHidden/>
+          </w:rPr>
+          <w:fldChar w:fldCharType="end"/>
+        </w:r>
+      </w:hyperlink>
+    </w:p>
+    <w:p>
+      <w:pPr>
+        <w:pStyle w:val="TOC2"/>
+        <w:tabs>
+          <w:tab w:val="right" w:leader="dot" w:pos="9736"/>
+        </w:tabs>
+        <w:rPr>
+          <w:noProof/>
+        </w:rPr>
+      </w:pPr>
+      <w:hyperlink w:anchor="_Toc244103681" w:history="1">
+        <w:r>
+          <w:rPr>
+            <w:rStyle w:val="Hyperlink"/>
+            <w:noProof/>
+          </w:rPr>
+          <w:t>Keuzes die ik zelf heb gemaakt</w:t>
+        </w:r>
+        <w:r>
+          <w:rPr>
+            <w:noProof/>
+            <w:webHidden/>
+          </w:rPr>
+          <w:tab/>
+        </w:r>
+        <w:r>
+          <w:rPr>
+            <w:noProof/>
+            <w:webHidden/>
+          </w:rPr>
+          <w:fldChar w:fldCharType="begin"/>
+        </w:r>
+        <w:r>
+          <w:rPr>
+            <w:noProof/>
+            <w:webHidden/>
+          </w:rPr>
+          <w:instrText xml:space="preserve"> PAGEREF _Toc244103681 \h </w:instrText>
+        </w:r>
+        <w:r>
+          <w:rPr>
+            <w:noProof/>
+            <w:webHidden/>
+          </w:rPr>
+        </w:r>
+        <w:r>
+          <w:rPr>
+            <w:noProof/>
+            <w:webHidden/>
+          </w:rPr>
+          <w:fldChar w:fldCharType="separate"/>
+        </w:r>
+        <w:r>
+          <w:rPr>
+            <w:noProof/>
+            <w:webHidden/>
+          </w:rPr>
+          <w:t>5</w:t>
+        </w:r>
+        <w:r>
+          <w:rPr>
+            <w:noProof/>
+            <w:webHidden/>
+          </w:rPr>
+          <w:fldChar w:fldCharType="end"/>
+        </w:r>
+      </w:hyperlink>
+    </w:p>
+    <w:p>
+      <w:pPr>
+        <w:pStyle w:val="TOC2"/>
+        <w:tabs>
+          <w:tab w:val="right" w:leader="dot" w:pos="9736"/>
+        </w:tabs>
+        <w:rPr>
+          <w:noProof/>
+        </w:rPr>
+      </w:pPr>
+      <w:hyperlink w:anchor="_Toc244103682" w:history="1">
+        <w:r>
+          <w:rPr>
+            <w:rStyle w:val="Hyperlink"/>
+            <w:noProof/>
+          </w:rPr>
+          <w:t>Problemen die ik heb opgelost</w:t>
+        </w:r>
+        <w:r>
+          <w:rPr>
+            <w:noProof/>
+            <w:webHidden/>
+          </w:rPr>
+          <w:tab/>
+        </w:r>
+        <w:r>
+          <w:rPr>
+            <w:noProof/>
+            <w:webHidden/>
+          </w:rPr>
+          <w:fldChar w:fldCharType="begin"/>
+        </w:r>
+        <w:r>
+          <w:rPr>
+            <w:noProof/>
+            <w:webHidden/>
+          </w:rPr>
+          <w:instrText xml:space="preserve"> PAGEREF _Toc244103682 \h </w:instrText>
+        </w:r>
+        <w:r>
+          <w:rPr>
+            <w:noProof/>
+            <w:webHidden/>
+          </w:rPr>
+        </w:r>
+        <w:r>
+          <w:rPr>
+            <w:noProof/>
+            <w:webHidden/>
+          </w:rPr>
+          <w:fldChar w:fldCharType="separate"/>
+        </w:r>
+        <w:r>
+          <w:rPr>
+            <w:noProof/>
+            <w:webHidden/>
+          </w:rPr>
+          <w:t>6</w:t>
+        </w:r>
+        <w:r>
+          <w:rPr>
+            <w:noProof/>
+            <w:webHidden/>
+          </w:rPr>
+          <w:fldChar w:fldCharType="end"/>
+        </w:r>
+      </w:hyperlink>
+    </w:p>
+    <w:p>
+      <w:pPr>
+        <w:pStyle w:val="TOC2"/>
+        <w:tabs>
+          <w:tab w:val="right" w:leader="dot" w:pos="9736"/>
+        </w:tabs>
+        <w:rPr>
+          <w:noProof/>
+        </w:rPr>
+      </w:pPr>
+      <w:hyperlink w:anchor="_Toc244103683" w:history="1">
+        <w:r>
+          <w:rPr>
+            <w:rStyle w:val="Hyperlink"/>
+            <w:noProof/>
+          </w:rPr>
+          <w:t>Wat ik de volgende keer anders zou doen</w:t>
+        </w:r>
+        <w:r>
+          <w:rPr>
+            <w:noProof/>
+            <w:webHidden/>
+          </w:rPr>
+          <w:tab/>
+        </w:r>
+        <w:r>
+          <w:rPr>
+            <w:noProof/>
+            <w:webHidden/>
+          </w:rPr>
+          <w:fldChar w:fldCharType="begin"/>
+        </w:r>
+        <w:r>
+          <w:rPr>
+            <w:noProof/>
+            <w:webHidden/>
+          </w:rPr>
+          <w:instrText xml:space="preserve"> PAGEREF _Toc244103683 \h </w:instrText>
+        </w:r>
+        <w:r>
+          <w:rPr>
+            <w:noProof/>
+            <w:webHidden/>
+          </w:rPr>
+        </w:r>
+        <w:r>
+          <w:rPr>
+            <w:noProof/>
+            <w:webHidden/>
+          </w:rPr>
+          <w:fldChar w:fldCharType="separate"/>
+        </w:r>
+        <w:r>
+          <w:rPr>
+            <w:noProof/>
+            <w:webHidden/>
+          </w:rPr>
+          <w:t>6</w:t>
         </w:r>
         <w:r>
           <w:rPr>
@@ -456,7 +796,7 @@
       <w:pPr>
         <w:pStyle w:val="Heading1"/>
       </w:pPr>
-      <w:bookmarkStart w:id="0" w:name="_Toc244102828"/>
+      <w:bookmarkStart w:id="0" w:name="_Toc244103674"/>
       <w:r>
         <w:t>Deel A: User stories en criteria</w:t>
       </w:r>
@@ -466,7 +806,7 @@
       <w:pPr>
         <w:pStyle w:val="Heading2"/>
       </w:pPr>
-      <w:bookmarkStart w:id="1" w:name="_Toc244102829"/>
+      <w:bookmarkStart w:id="1" w:name="_Toc244103675"/>
       <w:r>
         <w:t>US: SMILES inlezen met RDKit</w:t>
       </w:r>
@@ -973,7 +1313,7 @@
       <w:pPr>
         <w:pStyle w:val="Heading2"/>
       </w:pPr>
-      <w:bookmarkStart w:id="2" w:name="_Toc244102830"/>
+      <w:bookmarkStart w:id="2" w:name="_Toc244103676"/>
       <w:r>
         <w:t>LS: RDKit-data naar Gemini, uitleg op niveau</w:t>
       </w:r>
@@ -1563,7 +1903,7 @@
       <w:pPr>
         <w:pStyle w:val="Heading2"/>
       </w:pPr>
-      <w:bookmarkStart w:id="3" w:name="_Toc244102831"/>
+      <w:bookmarkStart w:id="3" w:name="_Toc244103677"/>
       <w:r>
         <w:t>Onderzoeksstory: chemische data en AI-uitleg combineren</w:t>
       </w:r>
@@ -2013,7 +2353,7 @@
       <w:pPr>
         <w:pStyle w:val="Heading1"/>
       </w:pPr>
-      <w:bookmarkStart w:id="4" w:name="_Toc244102832"/>
+      <w:bookmarkStart w:id="4" w:name="_Toc244103678"/>
       <w:r>
         <w:t>Deel B: Leeruitkomsten</w:t>
       </w:r>
@@ -2722,16 +3062,36 @@
             </w:pPr>
             <w:r>
               <w:rPr>
+                <w:sz w:val="18"/>
+              </w:rPr>
+              <w:t xml:space="preserve">Ik heb het project zelf gestuurd: vooraf een backlog met stories, acceptatie- en kwaliteitscriteria opgesteld, tussentijds getest en bijgestuurd (meer fysische eigenschappen, een risk assessment voor labverslagen), zelf keuzes gemaakt over scope en techniek, en problemen opgelost tot en met de online publicatie. Zie de toelichting hieronder. </w:t>
+            </w:r>
+            <w:r>
+              <w:rPr>
                 <w:b/>
                 <w:sz w:val="18"/>
               </w:rPr>
-              <w:t>[Dit deel moet je zelf schrijven.]</w:t>
-            </w:r>
-            <w:r>
-              <w:rPr>
-                <w:sz w:val="18"/>
-              </w:rPr>
-              <w:t xml:space="preserve"> Mogelijke onderwerpen: hoe je de backlog met stories en criteria hebt opgesteld, welke keuzes je zelf maakte (bijvoorbeeld Gemini in plaats van ChatGPT, of PubChem als bron), hoe je problemen oploste (zoals het lange Windows-pad, de ontbrekende H225, Nederlandse stofnamen en de overbelaste Gemini-modellen; zie onderzoeksverslag §4.4 en §6), en wat je de volgende keer anders zou doen.</w:t>
+              <w:t>Bewijs:</w:t>
+            </w:r>
+            <w:r>
+              <w:rPr>
+                <w:sz w:val="18"/>
+              </w:rPr>
+              <w:t xml:space="preserve"> de backlog, de versiegeschiedenis op GitHub (</w:t>
+            </w:r>
+            <w:r>
+              <w:rPr>
+                <w:rFonts w:ascii="Consolas" w:hAnsi="Consolas"/>
+                <w:color w:val="A31515"/>
+                <w:sz w:val="18"/>
+              </w:rPr>
+              <w:t>Noahkloos/molecul-info</w:t>
+            </w:r>
+            <w:r>
+              <w:rPr>
+                <w:sz w:val="18"/>
+              </w:rPr>
+              <w:t>), onderzoeksverslag §4.4 en §6.</w:t>
             </w:r>
           </w:p>
         </w:tc>
@@ -2741,6 +3101,696 @@
       <w:pPr>
         <w:spacing w:after="40"/>
       </w:pPr>
+    </w:p>
+    <w:p>
+      <w:pPr>
+        <w:pStyle w:val="Heading1"/>
+      </w:pPr>
+      <w:bookmarkStart w:id="5" w:name="_Toc244103679"/>
+      <w:r>
+        <w:t>Toelichting LU 5: zelfstandig en zelfsturend werken</w:t>
+      </w:r>
+      <w:bookmarkEnd w:id="5"/>
+    </w:p>
+    <w:p>
+      <w:pPr>
+        <w:pStyle w:val="Heading2"/>
+      </w:pPr>
+      <w:bookmarkStart w:id="6" w:name="_Toc244103680"/>
+      <w:r>
+        <w:t>Hoe ik het project heb aangepakt</w:t>
+      </w:r>
+      <w:bookmarkEnd w:id="6"/>
+    </w:p>
+    <w:p>
+      <w:r>
+        <w:t>Ik ben begonnen met een backlog: een user story, een leerstory en een onderzoeksstory, elk met acceptatie- en kwaliteitscriteria, plus de vijf leeruitkomsten die ik moest aantonen. Met die backlog als opdracht heb ik Claude Code de eerste versie laten bouwen. Zo had ik vanaf het begin een duidelijk eindbeeld waarmee ik het resultaat kon controleren, en hoefde ik niet alleen te vertrouwen op wat de AI opleverde.</w:t>
+      </w:r>
+    </w:p>
+    <w:p>
+      <w:r>
+        <w:t>Daarna heb ik in korte rondes gewerkt: de app gebruiken, kijken wat ontbrak of niet klopte, en gericht bijsturen. Op die manier heb ik de volgende stappen zelf bepaald:</w:t>
+      </w:r>
+    </w:p>
+    <w:p>
+      <w:pPr>
+        <w:pStyle w:val="ListBullet"/>
+        <w:spacing w:after="60"/>
+      </w:pPr>
+      <w:r>
+        <w:rPr>
+          <w:b/>
+        </w:rPr>
+        <w:t>Meer fysische eigenschappen.</w:t>
+      </w:r>
+      <w:r>
+        <w:t xml:space="preserve"> De eerste versie toonde 12 eigenschappen. Voor een chemicus is dat te weinig, dus ik heb gevraagd om uitbreiding. Nu zijn er tot 30 eigenschappen in zes groepen.</w:t>
+      </w:r>
+    </w:p>
+    <w:p>
+      <w:pPr>
+        <w:pStyle w:val="ListBullet"/>
+        <w:spacing w:after="60"/>
+      </w:pPr>
+      <w:r>
+        <w:rPr>
+          <w:b/>
+        </w:rPr>
+        <w:t>Een risk assessment voor het labverslag.</w:t>
+      </w:r>
+      <w:r>
+        <w:t xml:space="preserve"> Tijdens het werken zag ik dat de app ook nuttig kon zijn bij iets wat ik bij elke proef moet doen: een </w:t>
+      </w:r>
+      <w:r>
+        <w:rPr>
+          <w:i/>
+        </w:rPr>
+        <w:t>Hazardous Substance Risk Assessment</w:t>
+      </w:r>
+      <w:r>
+        <w:t xml:space="preserve"> invullen. Ik heb ons schoolsjabloon als voorbeeld gegeven. Nu maakt de app een ingevuld Word-document in dat format.</w:t>
+      </w:r>
+    </w:p>
+    <w:p>
+      <w:pPr>
+        <w:pStyle w:val="ListBullet"/>
+        <w:spacing w:after="60"/>
+      </w:pPr>
+      <w:r>
+        <w:rPr>
+          <w:b/>
+        </w:rPr>
+        <w:t>Documentatie in Word.</w:t>
+      </w:r>
+      <w:r>
+        <w:t xml:space="preserve"> Het verslag en deze verantwoording heb ik als opgemaakte Word-documenten laten maken, zodat ze geschikt zijn om in te leveren.</w:t>
+      </w:r>
+    </w:p>
+    <w:p>
+      <w:pPr>
+        <w:pStyle w:val="Heading2"/>
+      </w:pPr>
+      <w:bookmarkStart w:id="7" w:name="_Toc244103681"/>
+      <w:r>
+        <w:t>Keuzes die ik zelf heb gemaakt</w:t>
+      </w:r>
+      <w:bookmarkEnd w:id="7"/>
+    </w:p>
+    <w:p>
+      <w:pPr>
+        <w:pStyle w:val="ListBullet"/>
+        <w:spacing w:after="60"/>
+      </w:pPr>
+      <w:r>
+        <w:rPr>
+          <w:b/>
+        </w:rPr>
+        <w:t>Gemini in plaats van ChatGPT.</w:t>
+      </w:r>
+      <w:r>
+        <w:t xml:space="preserve"> In mijn leerstory stond eerst "ChatGPT", maar de criteria noemden Gemini. Ik heb gekozen voor Gemini, vooral vanwege de gratis laag en Google AI Studio (onderbouwing in onderzoeksverslag §8).</w:t>
+      </w:r>
+    </w:p>
+    <w:p>
+      <w:pPr>
+        <w:pStyle w:val="ListBullet"/>
+        <w:spacing w:after="60"/>
+      </w:pPr>
+      <w:r>
+        <w:rPr>
+          <w:b/>
+        </w:rPr>
+        <w:t>PubChem als bron, AI alleen voor de formulering.</w:t>
+      </w:r>
+      <w:r>
+        <w:t xml:space="preserve"> Alle feiten komen uit RDKit en PubChem, met bronvermelding. Voor de risk assessment heb ik bewust gekozen voor vaste regels in plaats van AI, omdat het een veiligheidsdocument is.</w:t>
+      </w:r>
+    </w:p>
+    <w:p>
+      <w:pPr>
+        <w:pStyle w:val="ListBullet"/>
+        <w:spacing w:after="60"/>
+      </w:pPr>
+      <w:r>
+        <w:rPr>
+          <w:b/>
+        </w:rPr>
+        <w:t>Scope bewaken.</w:t>
+      </w:r>
+      <w:r>
+        <w:t xml:space="preserve"> De H- en P-zinnen staan in de officiële Engelse GHS-tekst. Een Nederlandse vertaling vond ik niet nodig, omdat de codes gelijk zijn en het sjabloon ook Engels is. Zo bleef er tijd over voor functies die meer opleverden.</w:t>
+      </w:r>
+    </w:p>
+    <w:p>
+      <w:pPr>
+        <w:pStyle w:val="ListBullet"/>
+        <w:spacing w:after="60"/>
+      </w:pPr>
+      <w:r>
+        <w:rPr>
+          <w:b/>
+        </w:rPr>
+        <w:t>Eigen hosting.</w:t>
+      </w:r>
+      <w:r>
+        <w:t xml:space="preserve"> Ik wilde geen Streamlit-knop in de app, maar het project zelf beheren via GitHub en zelf online zetten.</w:t>
+      </w:r>
+    </w:p>
+    <w:p>
+      <w:pPr>
+        <w:pStyle w:val="Heading2"/>
+      </w:pPr>
+      <w:bookmarkStart w:id="8" w:name="_Toc244103682"/>
+      <w:r>
+        <w:t>Problemen die ik heb opgelost</w:t>
+      </w:r>
+      <w:bookmarkEnd w:id="8"/>
+    </w:p>
+    <w:tbl>
+      <w:tblPr>
+        <w:tblStyle w:val="TableGrid"/>
+        <w:tblW w:w="0" w:type="auto"/>
+        <w:jc w:val="center"/>
+        <w:tblLook w:val="04A0" w:firstRow="1" w:lastRow="0" w:firstColumn="1" w:lastColumn="0" w:noHBand="0" w:noVBand="1"/>
+      </w:tblPr>
+      <w:tblGrid>
+        <w:gridCol w:w="2086"/>
+        <w:gridCol w:w="3995"/>
+        <w:gridCol w:w="3329"/>
+      </w:tblGrid>
+      <w:tr>
+        <w:trPr>
+          <w:tblHeader/>
+          <w:jc w:val="center"/>
+        </w:trPr>
+        <w:tc>
+          <w:tcPr>
+            <w:tcW w:w="2086" w:type="dxa"/>
+            <w:shd w:val="clear" w:color="auto" w:fill="1F4E79"/>
+          </w:tcPr>
+          <w:p>
+            <w:pPr>
+              <w:spacing w:after="40" w:line="240" w:lineRule="auto"/>
+            </w:pPr>
+            <w:r>
+              <w:rPr>
+                <w:b/>
+                <w:color w:val="FFFFFF"/>
+                <w:sz w:val="18"/>
+              </w:rPr>
+              <w:t>Probleem</w:t>
+            </w:r>
+          </w:p>
+        </w:tc>
+        <w:tc>
+          <w:tcPr>
+            <w:tcW w:w="3995" w:type="dxa"/>
+            <w:shd w:val="clear" w:color="auto" w:fill="1F4E79"/>
+          </w:tcPr>
+          <w:p>
+            <w:pPr>
+              <w:spacing w:after="40" w:line="240" w:lineRule="auto"/>
+            </w:pPr>
+            <w:r>
+              <w:rPr>
+                <w:b/>
+                <w:color w:val="FFFFFF"/>
+                <w:sz w:val="18"/>
+              </w:rPr>
+              <w:t>Wat ik deed</w:t>
+            </w:r>
+          </w:p>
+        </w:tc>
+        <w:tc>
+          <w:tcPr>
+            <w:tcW w:w="3329" w:type="dxa"/>
+            <w:shd w:val="clear" w:color="auto" w:fill="1F4E79"/>
+          </w:tcPr>
+          <w:p>
+            <w:pPr>
+              <w:spacing w:after="40" w:line="240" w:lineRule="auto"/>
+            </w:pPr>
+            <w:r>
+              <w:rPr>
+                <w:b/>
+                <w:color w:val="FFFFFF"/>
+                <w:sz w:val="18"/>
+              </w:rPr>
+              <w:t>Wat ik ervan leerde</w:t>
+            </w:r>
+          </w:p>
+        </w:tc>
+      </w:tr>
+      <w:tr>
+        <w:trPr>
+          <w:jc w:val="center"/>
+        </w:trPr>
+        <w:tc>
+          <w:tcPr>
+            <w:tcW w:w="2086" w:type="dxa"/>
+          </w:tcPr>
+          <w:p>
+            <w:pPr>
+              <w:spacing w:after="40" w:line="240" w:lineRule="auto"/>
+            </w:pPr>
+            <w:r>
+              <w:rPr>
+                <w:sz w:val="18"/>
+              </w:rPr>
+              <w:t>RDKit startte niet door een te lang Windows-pad</w:t>
+            </w:r>
+          </w:p>
+        </w:tc>
+        <w:tc>
+          <w:tcPr>
+            <w:tcW w:w="3995" w:type="dxa"/>
+          </w:tcPr>
+          <w:p>
+            <w:pPr>
+              <w:spacing w:after="40" w:line="240" w:lineRule="auto"/>
+            </w:pPr>
+            <w:r>
+              <w:rPr>
+                <w:sz w:val="18"/>
+              </w:rPr>
+              <w:t>De Python-omgeving op een kort pad gezet</w:t>
+            </w:r>
+          </w:p>
+        </w:tc>
+        <w:tc>
+          <w:tcPr>
+            <w:tcW w:w="3329" w:type="dxa"/>
+          </w:tcPr>
+          <w:p>
+            <w:pPr>
+              <w:spacing w:after="40" w:line="240" w:lineRule="auto"/>
+            </w:pPr>
+            <w:r>
+              <w:rPr>
+                <w:sz w:val="18"/>
+              </w:rPr>
+              <w:t>Foutmeldingen lezen in plaats van gokken; de omgeving telt ook mee</w:t>
+            </w:r>
+          </w:p>
+        </w:tc>
+      </w:tr>
+      <w:tr>
+        <w:trPr>
+          <w:jc w:val="center"/>
+        </w:trPr>
+        <w:tc>
+          <w:tcPr>
+            <w:tcW w:w="2086" w:type="dxa"/>
+            <w:shd w:val="clear" w:color="auto" w:fill="EAF1F8"/>
+          </w:tcPr>
+          <w:p>
+            <w:pPr>
+              <w:spacing w:after="40" w:line="240" w:lineRule="auto"/>
+            </w:pPr>
+            <w:r>
+              <w:rPr>
+                <w:sz w:val="18"/>
+              </w:rPr>
+              <w:t>H225 (licht ontvlambaar) ontbrak bij ethanol</w:t>
+            </w:r>
+          </w:p>
+        </w:tc>
+        <w:tc>
+          <w:tcPr>
+            <w:tcW w:w="3995" w:type="dxa"/>
+            <w:shd w:val="clear" w:color="auto" w:fill="EAF1F8"/>
+          </w:tcPr>
+          <w:p>
+            <w:pPr>
+              <w:spacing w:after="40" w:line="240" w:lineRule="auto"/>
+            </w:pPr>
+            <w:r>
+              <w:rPr>
+                <w:sz w:val="18"/>
+              </w:rPr>
+              <w:t xml:space="preserve">Oorzaak gevonden (de notatie </w:t>
+            </w:r>
+            <w:r>
+              <w:rPr>
+                <w:rFonts w:ascii="Consolas" w:hAnsi="Consolas"/>
+                <w:color w:val="A31515"/>
+                <w:sz w:val="18"/>
+              </w:rPr>
+              <w:t>&gt; 99.9%</w:t>
+            </w:r>
+            <w:r>
+              <w:rPr>
+                <w:sz w:val="18"/>
+              </w:rPr>
+              <w:t>) en een test toegevoegd</w:t>
+            </w:r>
+          </w:p>
+        </w:tc>
+        <w:tc>
+          <w:tcPr>
+            <w:tcW w:w="3329" w:type="dxa"/>
+            <w:shd w:val="clear" w:color="auto" w:fill="EAF1F8"/>
+          </w:tcPr>
+          <w:p>
+            <w:pPr>
+              <w:spacing w:after="40" w:line="240" w:lineRule="auto"/>
+            </w:pPr>
+            <w:r>
+              <w:rPr>
+                <w:sz w:val="18"/>
+              </w:rPr>
+              <w:t>Uitvoer altijd controleren tegen de bron; een test voorkomt herhaling</w:t>
+            </w:r>
+          </w:p>
+        </w:tc>
+      </w:tr>
+      <w:tr>
+        <w:trPr>
+          <w:jc w:val="center"/>
+        </w:trPr>
+        <w:tc>
+          <w:tcPr>
+            <w:tcW w:w="2086" w:type="dxa"/>
+          </w:tcPr>
+          <w:p>
+            <w:pPr>
+              <w:spacing w:after="40" w:line="240" w:lineRule="auto"/>
+            </w:pPr>
+            <w:r>
+              <w:rPr>
+                <w:sz w:val="18"/>
+              </w:rPr>
+              <w:t>Nederlandse namen zoals "cafeïne" niet gevonden</w:t>
+            </w:r>
+          </w:p>
+        </w:tc>
+        <w:tc>
+          <w:tcPr>
+            <w:tcW w:w="3995" w:type="dxa"/>
+          </w:tcPr>
+          <w:p>
+            <w:pPr>
+              <w:spacing w:after="40" w:line="240" w:lineRule="auto"/>
+            </w:pPr>
+            <w:r>
+              <w:rPr>
+                <w:sz w:val="18"/>
+              </w:rPr>
+              <w:t>Vaste vertalingen plus een AI-vertaling die in PubChem wordt gecontroleerd</w:t>
+            </w:r>
+          </w:p>
+        </w:tc>
+        <w:tc>
+          <w:tcPr>
+            <w:tcW w:w="3329" w:type="dxa"/>
+          </w:tcPr>
+          <w:p>
+            <w:pPr>
+              <w:spacing w:after="40" w:line="240" w:lineRule="auto"/>
+            </w:pPr>
+            <w:r>
+              <w:rPr>
+                <w:sz w:val="18"/>
+              </w:rPr>
+              <w:t>AI kan helpen, mits het resultaat wordt gecontroleerd</w:t>
+            </w:r>
+          </w:p>
+        </w:tc>
+      </w:tr>
+      <w:tr>
+        <w:trPr>
+          <w:jc w:val="center"/>
+        </w:trPr>
+        <w:tc>
+          <w:tcPr>
+            <w:tcW w:w="2086" w:type="dxa"/>
+            <w:shd w:val="clear" w:color="auto" w:fill="EAF1F8"/>
+          </w:tcPr>
+          <w:p>
+            <w:pPr>
+              <w:spacing w:after="40" w:line="240" w:lineRule="auto"/>
+            </w:pPr>
+            <w:r>
+              <w:rPr>
+                <w:sz w:val="18"/>
+              </w:rPr>
+              <w:t>Gemini gaf HTTP 503 en 429</w:t>
+            </w:r>
+          </w:p>
+        </w:tc>
+        <w:tc>
+          <w:tcPr>
+            <w:tcW w:w="3995" w:type="dxa"/>
+            <w:shd w:val="clear" w:color="auto" w:fill="EAF1F8"/>
+          </w:tcPr>
+          <w:p>
+            <w:pPr>
+              <w:spacing w:after="40" w:line="240" w:lineRule="auto"/>
+            </w:pPr>
+            <w:r>
+              <w:rPr>
+                <w:sz w:val="18"/>
+              </w:rPr>
+              <w:t>Zelf de oorzaak laten uitzoeken: de gratis laag staat 5 verzoeken per minuut en 20 per dag toe. Daarna reservemodellen, quotumherkenning en een cache toegevoegd</w:t>
+            </w:r>
+          </w:p>
+        </w:tc>
+        <w:tc>
+          <w:tcPr>
+            <w:tcW w:w="3329" w:type="dxa"/>
+            <w:shd w:val="clear" w:color="auto" w:fill="EAF1F8"/>
+          </w:tcPr>
+          <w:p>
+            <w:pPr>
+              <w:spacing w:after="40" w:line="240" w:lineRule="auto"/>
+            </w:pPr>
+            <w:r>
+              <w:rPr>
+                <w:sz w:val="18"/>
+              </w:rPr>
+              <w:t>Een gratis API heeft grenzen waar je in je ontwerp rekening mee moet houden</w:t>
+            </w:r>
+          </w:p>
+        </w:tc>
+      </w:tr>
+      <w:tr>
+        <w:trPr>
+          <w:jc w:val="center"/>
+        </w:trPr>
+        <w:tc>
+          <w:tcPr>
+            <w:tcW w:w="2086" w:type="dxa"/>
+          </w:tcPr>
+          <w:p>
+            <w:pPr>
+              <w:spacing w:after="40" w:line="240" w:lineRule="auto"/>
+            </w:pPr>
+            <w:r>
+              <w:rPr>
+                <w:sz w:val="18"/>
+              </w:rPr>
+              <w:t>Git was nieuw voor mij</w:t>
+            </w:r>
+          </w:p>
+        </w:tc>
+        <w:tc>
+          <w:tcPr>
+            <w:tcW w:w="3995" w:type="dxa"/>
+          </w:tcPr>
+          <w:p>
+            <w:pPr>
+              <w:spacing w:after="40" w:line="240" w:lineRule="auto"/>
+            </w:pPr>
+            <w:r>
+              <w:rPr>
+                <w:sz w:val="18"/>
+              </w:rPr>
+              <w:t>Git geïnstalleerd en geleerd. Ik maakte eerst een repository in de verkeerde map en gebruikte een verkeerde repositorynaam. Ik ben gestopt voordat er iets fout ging, heb het hersteld en het project op GitHub gezet</w:t>
+            </w:r>
+          </w:p>
+        </w:tc>
+        <w:tc>
+          <w:tcPr>
+            <w:tcW w:w="3329" w:type="dxa"/>
+          </w:tcPr>
+          <w:p>
+            <w:pPr>
+              <w:spacing w:after="40" w:line="240" w:lineRule="auto"/>
+            </w:pPr>
+            <w:r>
+              <w:rPr>
+                <w:sz w:val="18"/>
+              </w:rPr>
+              <w:t>Bij een fout eerst stoppen en uitzoeken wat er gebeurde, dan pas verder</w:t>
+            </w:r>
+          </w:p>
+        </w:tc>
+      </w:tr>
+      <w:tr>
+        <w:trPr>
+          <w:jc w:val="center"/>
+        </w:trPr>
+        <w:tc>
+          <w:tcPr>
+            <w:tcW w:w="2086" w:type="dxa"/>
+            <w:shd w:val="clear" w:color="auto" w:fill="EAF1F8"/>
+          </w:tcPr>
+          <w:p>
+            <w:pPr>
+              <w:spacing w:after="40" w:line="240" w:lineRule="auto"/>
+            </w:pPr>
+            <w:r>
+              <w:rPr>
+                <w:sz w:val="18"/>
+              </w:rPr>
+              <w:t>De app werkte niet op Vercel</w:t>
+            </w:r>
+          </w:p>
+        </w:tc>
+        <w:tc>
+          <w:tcPr>
+            <w:tcW w:w="3995" w:type="dxa"/>
+            <w:shd w:val="clear" w:color="auto" w:fill="EAF1F8"/>
+          </w:tcPr>
+          <w:p>
+            <w:pPr>
+              <w:spacing w:after="40" w:line="240" w:lineRule="auto"/>
+            </w:pPr>
+            <w:r>
+              <w:rPr>
+                <w:sz w:val="18"/>
+              </w:rPr>
+              <w:t xml:space="preserve">Uitgezocht waarom (Vercel ondersteunt geen Streamlit) en overgestapt naar Streamlit Community Cloud. Daar de RDKit-fout opgelost met </w:t>
+            </w:r>
+            <w:r>
+              <w:rPr>
+                <w:rFonts w:ascii="Consolas" w:hAnsi="Consolas"/>
+                <w:color w:val="A31515"/>
+                <w:sz w:val="18"/>
+              </w:rPr>
+              <w:t>packages.txt</w:t>
+            </w:r>
+          </w:p>
+        </w:tc>
+        <w:tc>
+          <w:tcPr>
+            <w:tcW w:w="3329" w:type="dxa"/>
+            <w:shd w:val="clear" w:color="auto" w:fill="EAF1F8"/>
+          </w:tcPr>
+          <w:p>
+            <w:pPr>
+              <w:spacing w:after="40" w:line="240" w:lineRule="auto"/>
+            </w:pPr>
+            <w:r>
+              <w:rPr>
+                <w:sz w:val="18"/>
+              </w:rPr>
+              <w:t>Eerst controleren of een platform past bij de technologie</w:t>
+            </w:r>
+          </w:p>
+        </w:tc>
+      </w:tr>
+    </w:tbl>
+    <w:p>
+      <w:pPr>
+        <w:spacing w:after="40"/>
+      </w:pPr>
+    </w:p>
+    <w:p>
+      <w:pPr>
+        <w:pStyle w:val="Heading2"/>
+      </w:pPr>
+      <w:bookmarkStart w:id="9" w:name="_Toc244103683"/>
+      <w:r>
+        <w:t>Wat ik de volgende keer anders zou doen</w:t>
+      </w:r>
+      <w:bookmarkEnd w:id="9"/>
+    </w:p>
+    <w:p>
+      <w:pPr>
+        <w:pStyle w:val="ListNumber"/>
+        <w:spacing w:after="60"/>
+      </w:pPr>
+      <w:r>
+        <w:rPr>
+          <w:b/>
+        </w:rPr>
+        <w:t>Het hostingplatform eerder kiezen.</w:t>
+      </w:r>
+      <w:r>
+        <w:t xml:space="preserve"> Ik had vooraf moeten onderzoeken of Vercel Streamlit ondersteunt. Dat had een mislukte deployment gescheeld.</w:t>
+      </w:r>
+    </w:p>
+    <w:p>
+      <w:pPr>
+        <w:pStyle w:val="ListNumber"/>
+        <w:spacing w:after="60"/>
+      </w:pPr>
+      <w:r>
+        <w:rPr>
+          <w:b/>
+        </w:rPr>
+        <w:t>Vanaf dag één in een vaste map met Git werken</w:t>
+      </w:r>
+      <w:r>
+        <w:t xml:space="preserve"> en na elke werkende stap committen. Dan staat de geschiedenis van het project vast en is terugdraaien makkelijker.</w:t>
+      </w:r>
+    </w:p>
+    <w:p>
+      <w:pPr>
+        <w:pStyle w:val="ListNumber"/>
+        <w:spacing w:after="60"/>
+      </w:pPr>
+      <w:r>
+        <w:rPr>
+          <w:b/>
+        </w:rPr>
+        <w:t>Zuinig zijn met het API-quotum.</w:t>
+      </w:r>
+      <w:r>
+        <w:t xml:space="preserve"> Testen met de prompt alleen (</w:t>
+      </w:r>
+      <w:r>
+        <w:rPr>
+          <w:rFonts w:ascii="Consolas" w:hAnsi="Consolas"/>
+          <w:color w:val="A31515"/>
+          <w:sz w:val="18"/>
+        </w:rPr>
+        <w:t>--droog</w:t>
+      </w:r>
+      <w:r>
+        <w:t>) en pas daarna echte aanroepen doen, of voor intensief gebruik een betaalde sleutel regelen.</w:t>
+      </w:r>
+    </w:p>
+    <w:p>
+      <w:pPr>
+        <w:pStyle w:val="ListNumber"/>
+        <w:spacing w:after="60"/>
+      </w:pPr>
+      <w:r>
+        <w:rPr>
+          <w:b/>
+        </w:rPr>
+        <w:t>Volledige input meteen aanleveren.</w:t>
+      </w:r>
+      <w:r>
+        <w:t xml:space="preserve"> Ik gaf maar een deel van het risk-assessmentsjabloon, waardoor de onderste helft is ingevuld met een eigen indeling. Met het hele sjabloon was dat in één keer goed gegaan.</w:t>
+      </w:r>
+    </w:p>
+    <w:p>
+      <w:pPr>
+        <w:pStyle w:val="ListNumber"/>
+        <w:spacing w:after="60"/>
+      </w:pPr>
+      <w:r>
+        <w:rPr>
+          <w:b/>
+        </w:rPr>
+        <w:t>De AI-uitleg laten controleren door een vakdocent</w:t>
+      </w:r>
+      <w:r>
+        <w:t>, vooral op redeneringen. Daar zaten de laatste fouten in, niet in de getallen.</w:t>
+      </w:r>
     </w:p>
     <w:p>
       <w:pPr>
@@ -3028,31 +4078,31 @@
       </w:rPr>
     </w:lvl>
   </w:abstractNum>
-  <w:num w:numId="1" w16cid:durableId="1984845570">
+  <w:num w:numId="1" w16cid:durableId="1088238300">
     <w:abstractNumId w:val="8"/>
   </w:num>
-  <w:num w:numId="2" w16cid:durableId="1154302043">
+  <w:num w:numId="2" w16cid:durableId="225144454">
     <w:abstractNumId w:val="6"/>
   </w:num>
-  <w:num w:numId="3" w16cid:durableId="778720964">
+  <w:num w:numId="3" w16cid:durableId="877813504">
     <w:abstractNumId w:val="5"/>
   </w:num>
-  <w:num w:numId="4" w16cid:durableId="578487125">
+  <w:num w:numId="4" w16cid:durableId="495540501">
     <w:abstractNumId w:val="4"/>
   </w:num>
-  <w:num w:numId="5" w16cid:durableId="895550185">
+  <w:num w:numId="5" w16cid:durableId="2119250823">
     <w:abstractNumId w:val="7"/>
   </w:num>
-  <w:num w:numId="6" w16cid:durableId="1020278507">
+  <w:num w:numId="6" w16cid:durableId="406537891">
     <w:abstractNumId w:val="3"/>
   </w:num>
-  <w:num w:numId="7" w16cid:durableId="1825118271">
+  <w:num w:numId="7" w16cid:durableId="952128458">
     <w:abstractNumId w:val="2"/>
   </w:num>
-  <w:num w:numId="8" w16cid:durableId="1161963191">
+  <w:num w:numId="8" w16cid:durableId="1002591364">
     <w:abstractNumId w:val="1"/>
   </w:num>
-  <w:num w:numId="9" w16cid:durableId="1946307803">
+  <w:num w:numId="9" w16cid:durableId="1523207132">
     <w:abstractNumId w:val="0"/>
   </w:num>
 </w:numbering>
@@ -14441,7 +15491,7 @@
     <w:autoRedefine/>
     <w:uiPriority w:val="39"/>
     <w:unhideWhenUsed/>
-    <w:rsid w:val="003B3B96"/>
+    <w:rsid w:val="00AB188E"/>
     <w:pPr>
       <w:spacing w:after="100"/>
     </w:pPr>
@@ -14453,7 +15503,7 @@
     <w:autoRedefine/>
     <w:uiPriority w:val="39"/>
     <w:unhideWhenUsed/>
-    <w:rsid w:val="003B3B96"/>
+    <w:rsid w:val="00AB188E"/>
     <w:pPr>
       <w:spacing w:after="100"/>
       <w:ind w:left="210"/>
@@ -14464,7 +15514,7 @@
     <w:basedOn w:val="DefaultParagraphFont"/>
     <w:uiPriority w:val="99"/>
     <w:unhideWhenUsed/>
-    <w:rsid w:val="003B3B96"/>
+    <w:rsid w:val="00AB188E"/>
     <w:rPr>
       <w:color w:val="0000FF" w:themeColor="hyperlink"/>
       <w:u w:val="single"/>

</xml_diff>